<commit_message>
Add test report v2 with independent reconciliation and the architecture v1.1 supplement
Test report v2: each answered table (and each part of a multi-request message) is
recomputed by its own SQL on the read-only warehouse account and compared row by row:
154 reconciliations match, none differ, 10 kinds of result (by product, category,
production line, scrap reason, growth) have no independent query yet and are listed
as such. The first-run result of each case is kept next to the final one.

The Word supplement for the architecture document covers the forecast and its
backtest, what is sent to the external AI, SQL checking, conversation context, AI
provider handling, deployment, test method and results, load, cost and risks. The
presentation script carries the new counts; the reconciler accepts a comparison that
says which groups it left out.
</commit_message>
<xml_diff>
--- a/docs/ACBI_bai_trinh_bay_v2.docx
+++ b/docs/ACBI_bai_trinh_bay_v2.docx
@@ -69,7 +69,7 @@
           <w:b w:val="0"/>
           <w:i w:val="0"/>
         </w:rPr>
-        <w:t>Các con số kiểm thử trong bài là kết quả ngày 13/10/2026 trên bản demo với AI thật: 161 ca (RAG 24, câu hỏi khó 90, so sánh và nhiều yêu cầu 47), đạt 161/161, 48 ca phân quyền đạt 48/48, kèm 281 kiểm thử tự động. Đo tải 5 người dùng đo lại: 39/60 câu trả lời được, 63% dưới 15 giây. Chi tiết ở file Excel ACBI_bao_cao_kiem_thu.xlsx.</w:t>
+        <w:t>Các con số kiểm thử trong bài là kết quả ngày 13/10/2026 trên bản demo với AI thật: 161 ca (RAG 24, câu hỏi khó 90, so sánh và nhiều yêu cầu 47), đạt 161/161, 48 ca phân quyền đạt 48/48, kèm 287 kiểm thử tự động. Đo tải 5 người dùng đo lại: 39/60 câu trả lời được, 63% dưới 15 giây. Chi tiết ở file Excel ACBI_bao_cao_kiem_thu.xlsx.</w:t>
       </w:r>
     </w:p>
     <w:tbl>
@@ -1267,7 +1267,7 @@
           <w:b w:val="0"/>
           <w:i w:val="0"/>
         </w:rPr>
-        <w:t>Về kiểm thử: chúng tôi chạy ba bộ câu hỏi trên bản demo với AI thật, tổng cộng 161 ca, và mỗi con số trả về được đối chiếu độc lập với kho dữ liệu bằng một câu SQL chỉ đọc. Bộ thứ nhất, 24 câu cần đường sinh SQL từ tài liệu: theo tuần, theo ngày, theo nhà máy và theo vai trò, đạt 24 trên 24. Bộ thứ hai, 90 câu hỏi khó gồm bẫy ảo giác, câu nhiều ràng buộc và đủ bốn vai trò, đạt 90 trên 90. Bộ thứ ba, 47 câu so sánh và tin nhắn nhiều yêu cầu, đạt 47 trên 47. Ở lượt chạy đầu có 12 ca báo AI bận vì gói AI miễn phí; chúng tôi chạy lại các ca đó cho đến khi không còn báo bận và đều đạt. Những ca sai vì lý do khác sẽ tính là sai và không được chạy lại để đổi kết quả. Bằng chứng từng ca, gồm câu hỏi, câu trả lời, câu SQL đối chiếu và ảnh chụp trình duyệt, nằm trong file Excel kèm theo. Ngoài ra, 48 ca phân quyền chạy đủ bốn vai trò trên cả đường mẫu và đường sinh SQL, đều đạt: không có dữ liệu ngoài quyền nào lọt ra, và tài khoản sản xuất chỉ thấy số liệu Factory A khớp kho dữ liệu. Còn 281 kiểm thử tự động cho phần logic.</w:t>
+        <w:t>Về kiểm thử: chúng tôi chạy ba bộ câu hỏi trên bản demo với AI thật, tổng cộng 161 ca, và mỗi con số trả về được đối chiếu độc lập với kho dữ liệu bằng một câu SQL chỉ đọc. Bộ thứ nhất, 24 câu cần đường sinh SQL từ tài liệu: theo tuần, theo ngày, theo nhà máy và theo vai trò, đạt 24 trên 24. Bộ thứ hai, 90 câu hỏi khó gồm bẫy ảo giác, câu nhiều ràng buộc và đủ bốn vai trò, đạt 90 trên 90. Bộ thứ ba, 47 câu so sánh và tin nhắn nhiều yêu cầu, đạt 47 trên 47. Ở lượt chạy đầu có 12 ca báo AI bận vì gói AI miễn phí; chúng tôi chạy lại các ca đó cho đến khi không còn báo bận và đều đạt. Những ca sai vì lý do khác sẽ tính là sai và không được chạy lại để đổi kết quả. Bằng chứng từng ca, gồm câu hỏi, câu trả lời, câu SQL đối chiếu và ảnh chụp trình duyệt, nằm trong file Excel kèm theo. Ngoài ra, 48 ca phân quyền chạy đủ bốn vai trò trên cả đường mẫu và đường sinh SQL, đều đạt: không có dữ liệu ngoài quyền nào lọt ra, và tài khoản sản xuất chỉ thấy số liệu Factory A khớp kho dữ liệu. Còn 287 kiểm thử tự động cho phần logic.</w:t>
       </w:r>
     </w:p>
     <w:p>

</xml_diff>